<commit_message>
Merge On-the-Fly Ingestion and Spotify Control in overview doc
They're the same mechanism — merged into one subsection under
"On-the-Fly Ingestion and Spotify Control".

Co-Authored-By: Claude Opus 4.6 (1M context) <noreply@anthropic.com>
</commit_message>
<xml_diff>
--- a/ALBart_Overview.docx
+++ b/ALBart_Overview.docx
@@ -382,12 +382,12 @@
         <w:pStyle w:val="Heading2"/>
       </w:pPr>
       <w:r>
-        <w:t>On-the-Fly Ingestion</w:t>
+        <w:t>On-the-Fly Ingestion and Spotify Control</w:t>
       </w:r>
     </w:p>
     <w:p>
       <w:r>
-        <w:t>When the DJ encounters an unknown track (e.g., the user queues something from Spotify that isn’t in the library), the system automatically ingests it in a background thread: fetch metadata from the Spotify API, download the preview, compute the CLAP embedding, project to 25D, and store in PostgreSQL. This typically completes in 15–20 seconds — well before the track finishes playing. The MapView shows the track’s title and artist immediately (from the Spotify API) and snaps to the correct position in the space once the embedding is ready.</w:t>
+        <w:t>When the DJ encounters an unknown track — whether it picked the track itself or the user queued it from Spotify — the system automatically ingests it in a background thread: fetch metadata from the Spotify API, download the preview, compute the CLAP embedding, project to 25D, and store in PostgreSQL. This typically completes in 15–20 seconds, well before the track finishes playing. The MapView shows the track’s title and artist immediately and snaps to the correct position once the embedding is ready. A “Spotify Control” mode lets the user drive playback manually while the system follows along, ingesting every unknown track it encounters and broadcasting positions to the MapView. This is a convenient way to build the library from existing playlists without waiting for the batch tool.</w:t>
       </w:r>
     </w:p>
     <w:p>
@@ -404,17 +404,11 @@
       </w:r>
     </w:p>
     <w:p>
-      <w:pPr>
-        <w:pStyle w:val="Heading2"/>
-      </w:pPr>
-      <w:r>
-        <w:t>Spotify Control Mode</w:t>
-      </w:r>
+      <w:pPr/>
+      <w:r/>
     </w:p>
     <w:p>
-      <w:r>
-        <w:t>A passive mode where the DJ follows Spotify without picking tracks. The user controls playback manually; the system monitors what’s playing, ingests unknown tracks, and broadcasts positions to the MapView. This is useful for building the library from existing playlists without waiting for the batch tool.</w:t>
-      </w:r>
+      <w:r/>
     </w:p>
     <w:p>
       <w:pPr>

</xml_diff>

<commit_message>
Consolidate orbit navigation into section 4, drop section 7
Merged orbit journey content (LLM anchor selection, attractor design,
same-artist decision, viewer description) into section 4's orbit
subsection. Removed section 7. Renumbered remaining sections 7-9.

Co-Authored-By: Claude Opus 4.6 (1M context) <noreply@anthropic.com>
</commit_message>
<xml_diff>
--- a/ALBart_Overview.docx
+++ b/ALBart_Overview.docx
@@ -186,17 +186,17 @@
     </w:p>
     <w:p>
       <w:r>
-        <w:t>The most distinctive feature. An orbit is a guided journey through the space, defined by a set of anchor tracks chosen by an LLM (Claude) based on a natural-language description like "trace the evolution of David Bowie" or "alternate between grunge and K-pop." The orbit operates as a two-phase state machine:</w:t>
+        <w:t>The most distinctive feature. An orbit is a guided journey through the space, defined by anchor tracks chosen by an LLM (Claude) based on a natural-language description like “trace the evolution of David Bowie” or “alternate between grunge and K-pop.” Claude selects tracks from the library that define the journey’s waypoints and determines whether same-artist runs should be allowed — a Ray Charles deep dive permits consecutive Ray Charles tracks; a genre survey prefers variety. The orbit operates as a two-phase state machine:</w:t>
       </w:r>
     </w:p>
     <w:p>
       <w:r>
-        <w:t>Dwell phase: The DJ plays tracks near the current anchor, exploring its neighborhood for a configurable duration (default 30 minutes). The anchor track itself is not played — it serves as an attractor that defines the neighborhood. This prevents iconic anchor tracks from being overplayed across repeated orbits.</w:t>
+        <w:t>Dwell phase: The DJ plays tracks near the current anchor, exploring its neighborhood for a configurable duration (default 30 minutes). Anchor tracks serve as attractors but are never played directly — the DJ plays tracks near them. This prevents iconic anchor tracks from being overplayed across repeated orbits, and ensures that each pass through the same anchor discovers different tracks.</w:t>
       </w:r>
     </w:p>
     <w:p>
       <w:r>
-        <w:t>Transit phase: The DJ moves from the current anchor toward the next one, interpolating through 25D space. Each transit step targets a fraction of the distance from the current track’s position to the destination anchor. Because the DJ picks from neighbors near each interpolation point (not along a fixed line), the path through the space is different every time — there isn’t just one route from grunge to K-pop.</w:t>
+        <w:t>Transit phase: The DJ moves from the current anchor toward the next one, interpolating through 25D space. Each step targets a fraction of the distance from the current track’s actual position to the destination anchor. Because the DJ picks from neighbors near each interpolation point (not along a fixed line), the path through the space is different every time — there isn’t just one route from grunge to K-pop.</w:t>
       </w:r>
     </w:p>
     <w:p>
@@ -209,7 +209,7 @@
           <w:color w:val="666699"/>
           <w:sz w:val="20"/>
         </w:rPr>
-        <w:t>[Screenshot: Orbit viewer showing anchors, transit progress bars, and dwell indicator]</w:t>
+        <w:t>[Screenshot: Orbit viewer showing anchors with album art, transit progress bars, and hover tooltip]</w:t>
       </w:r>
     </w:p>
     <w:p>
@@ -311,32 +311,20 @@
       </w:r>
     </w:p>
     <w:p>
-      <w:pPr>
-        <w:pStyle w:val="Heading1"/>
-      </w:pPr>
-      <w:r>
-        <w:t>7. Orbit Journeys</w:t>
-      </w:r>
+      <w:pPr/>
+      <w:r/>
     </w:p>
     <w:p>
-      <w:r>
-        <w:t>Orbit navigation turns the DJ into a guided tour of the embedding space. The user describes a journey in natural language — "explore the intersection of jazz and electronic music" or "trace the evolution of David Bowie" — and Claude selects anchor tracks from the library that define the journey’s waypoints.</w:t>
-      </w:r>
+      <w:r/>
     </w:p>
     <w:p>
-      <w:r>
-        <w:t>The orbit viewer in the control center shows the anchors arranged in a circle, connected by transit bars that fill in as the DJ progresses. Hovering over an anchor shows the album art, title, and artist. The current phase (dwelling or transiting) is displayed with timing information.</w:t>
-      </w:r>
+      <w:r/>
     </w:p>
     <w:p>
-      <w:r>
-        <w:t>A key design decision: anchor tracks serve as attractors but are never played directly. The DJ plays tracks near each anchor, ensuring that the neighborhood is explored without wearing out the iconic tracks. Across repeated orbits with the same anchors, the DJ discovers different tracks each time because the weighted random selection and varied transit paths ensure no two passes are identical.</w:t>
-      </w:r>
+      <w:r/>
     </w:p>
     <w:p>
-      <w:r>
-        <w:t>Claude also determines whether same-artist runs should be allowed based on the journey description. A "deep dive into Ray Charles" allows consecutive Ray Charles tracks; a "survey of 1970s rock" prefers variety.</w:t>
-      </w:r>
+      <w:r/>
     </w:p>
     <w:p>
       <w:pPr>
@@ -348,7 +336,6 @@
           <w:color w:val="666699"/>
           <w:sz w:val="20"/>
         </w:rPr>
-        <w:t>[Screenshot: Orbit viewer with Bowie anchors, transit progress, and dwell indicator]</w:t>
       </w:r>
     </w:p>
     <w:p>
@@ -356,7 +343,7 @@
         <w:pStyle w:val="Heading1"/>
       </w:pPr>
       <w:r>
-        <w:t>8. Growing the Library</w:t>
+        <w:t>7. Growing the Library</w:t>
       </w:r>
     </w:p>
     <w:p>
@@ -415,7 +402,7 @@
         <w:pStyle w:val="Heading1"/>
       </w:pPr>
       <w:r>
-        <w:t>9. Architecture and Portability</w:t>
+        <w:t>8. Architecture and Portability</w:t>
       </w:r>
     </w:p>
     <w:p>
@@ -472,7 +459,7 @@
         <w:pStyle w:val="Heading1"/>
       </w:pPr>
       <w:r>
-        <w:t>10. What’s Next</w:t>
+        <w:t>9. What’s Next</w:t>
       </w:r>
     </w:p>
     <w:p>

</xml_diff>